<commit_message>
link repositorio en evidencias y readme.md
</commit_message>
<xml_diff>
--- a/control-despensa-api/control-despensa-api/evidencias/Evidencias_API_Despensa_DylanGarcia.docx
+++ b/control-despensa-api/control-despensa-api/evidencias/Evidencias_API_Despensa_DylanGarcia.docx
@@ -718,10 +718,20 @@
         <w:pStyle w:val="Ttulo"/>
       </w:pPr>
       <w:r>
-        <w:t>Repositorio de GitHub</w:t>
-      </w:r>
-      <w:r>
-        <w:t>:</w:t>
+        <w:t>Repositorio de GitHub:</w:t>
+      </w:r>
+    </w:p>
+    <w:p>
+      <w:pPr>
+        <w:rPr>
+          <w:lang w:val="es-ES"/>
+        </w:rPr>
+      </w:pPr>
+      <w:r>
+        <w:rPr>
+          <w:lang w:val="es-ES"/>
+        </w:rPr>
+        <w:t>https://github.com/DYLANG187/programacion-II-2026/tree/main/control-despensa-api/control-despensa-api</w:t>
       </w:r>
     </w:p>
     <w:p>
@@ -900,7 +910,6 @@
         <w:pStyle w:val="Ttulo"/>
       </w:pPr>
       <w:r>
-        <w:lastRenderedPageBreak/>
         <w:t>Evidencias</w:t>
       </w:r>
     </w:p>
@@ -1027,7 +1036,6 @@
         <w:pStyle w:val="Ttulo"/>
       </w:pPr>
       <w:r>
-        <w:lastRenderedPageBreak/>
         <w:t>2. Estructura del proyecto</w:t>
       </w:r>
     </w:p>
@@ -1114,7 +1122,6 @@
         <w:pStyle w:val="Ttulo"/>
       </w:pPr>
       <w:r>
-        <w:lastRenderedPageBreak/>
         <w:t>3. Clase Producto</w:t>
       </w:r>
     </w:p>
@@ -1274,7 +1281,6 @@
         <w:pStyle w:val="Ttulo"/>
       </w:pPr>
       <w:r>
-        <w:lastRenderedPageBreak/>
         <w:t xml:space="preserve">4. Clase </w:t>
       </w:r>
       <w:proofErr w:type="spellStart"/>
@@ -1462,52 +1468,52 @@
         <w:pStyle w:val="Ttulo"/>
       </w:pPr>
       <w:r>
+        <w:t xml:space="preserve">5. </w:t>
+      </w:r>
+      <w:proofErr w:type="spellStart"/>
+      <w:r>
+        <w:t>ProductoController</w:t>
+      </w:r>
+      <w:proofErr w:type="spellEnd"/>
+    </w:p>
+    <w:p>
+      <w:pPr>
+        <w:pStyle w:val="Ttulo"/>
+      </w:pPr>
+    </w:p>
+    <w:p>
+      <w:pPr>
+        <w:pStyle w:val="Ttulo"/>
+      </w:pPr>
+      <w:r>
+        <w:t xml:space="preserve">Controlador REST que contiene los </w:t>
+      </w:r>
+      <w:proofErr w:type="spellStart"/>
+      <w:r>
+        <w:t>endpoints</w:t>
+      </w:r>
+      <w:proofErr w:type="spellEnd"/>
+      <w:r>
+        <w:t xml:space="preserve"> para consultar los productos de la despensa.</w:t>
+      </w:r>
+    </w:p>
+    <w:p>
+      <w:pPr>
+        <w:pStyle w:val="Ttulo"/>
+      </w:pPr>
+    </w:p>
+    <w:p>
+      <w:pPr>
+        <w:rPr>
+          <w:lang w:val="es-ES"/>
+        </w:rPr>
+      </w:pPr>
+      <w:r>
+        <w:rPr>
+          <w:noProof/>
+          <w:lang w:val="es-ES"/>
+        </w:rPr>
         <w:lastRenderedPageBreak/>
-        <w:t xml:space="preserve">5. </w:t>
-      </w:r>
-      <w:proofErr w:type="spellStart"/>
-      <w:r>
-        <w:t>ProductoController</w:t>
-      </w:r>
-      <w:proofErr w:type="spellEnd"/>
-    </w:p>
-    <w:p>
-      <w:pPr>
-        <w:pStyle w:val="Ttulo"/>
-      </w:pPr>
-    </w:p>
-    <w:p>
-      <w:pPr>
-        <w:pStyle w:val="Ttulo"/>
-      </w:pPr>
-      <w:r>
-        <w:t xml:space="preserve">Controlador REST que contiene los </w:t>
-      </w:r>
-      <w:proofErr w:type="spellStart"/>
-      <w:r>
-        <w:t>endpoints</w:t>
-      </w:r>
-      <w:proofErr w:type="spellEnd"/>
-      <w:r>
-        <w:t xml:space="preserve"> para consultar los productos de la despensa.</w:t>
-      </w:r>
-    </w:p>
-    <w:p>
-      <w:pPr>
-        <w:pStyle w:val="Ttulo"/>
-      </w:pPr>
-    </w:p>
-    <w:p>
-      <w:pPr>
-        <w:rPr>
-          <w:lang w:val="es-ES"/>
-        </w:rPr>
-      </w:pPr>
-      <w:r>
-        <w:rPr>
-          <w:noProof/>
-          <w:lang w:val="es-ES"/>
-        </w:rPr>
         <w:drawing>
           <wp:inline distT="0" distB="0" distL="0" distR="0" wp14:anchorId="41E49526" wp14:editId="4084884C">
             <wp:extent cx="5815013" cy="2905203"/>
@@ -1603,31 +1609,31 @@
         <w:pStyle w:val="Ttulo"/>
       </w:pPr>
       <w:r>
+        <w:t>6. Aplicación iniciada</w:t>
+      </w:r>
+    </w:p>
+    <w:p>
+      <w:pPr>
+        <w:pStyle w:val="Ttulo"/>
+      </w:pPr>
+    </w:p>
+    <w:p>
+      <w:pPr>
+        <w:pStyle w:val="Ttulo"/>
+      </w:pPr>
+      <w:r>
+        <w:t>Se ejecutó la aplicación correctamente en IntelliJ IDEA y Spring Boot inició el servidor.</w:t>
+      </w:r>
+    </w:p>
+    <w:p>
+      <w:pPr>
+        <w:pStyle w:val="Ttulo"/>
+      </w:pPr>
+      <w:r>
+        <w:rPr>
+          <w:noProof/>
+        </w:rPr>
         <w:lastRenderedPageBreak/>
-        <w:t>6. Aplicación iniciada</w:t>
-      </w:r>
-    </w:p>
-    <w:p>
-      <w:pPr>
-        <w:pStyle w:val="Ttulo"/>
-      </w:pPr>
-    </w:p>
-    <w:p>
-      <w:pPr>
-        <w:pStyle w:val="Ttulo"/>
-      </w:pPr>
-      <w:r>
-        <w:t>Se ejecutó la aplicación correctamente en IntelliJ IDEA y Spring Boot inició el servidor.</w:t>
-      </w:r>
-    </w:p>
-    <w:p>
-      <w:pPr>
-        <w:pStyle w:val="Ttulo"/>
-      </w:pPr>
-      <w:r>
-        <w:rPr>
-          <w:noProof/>
-        </w:rPr>
         <w:drawing>
           <wp:anchor distT="0" distB="0" distL="114300" distR="114300" simplePos="0" relativeHeight="251661312" behindDoc="0" locked="0" layoutInCell="1" allowOverlap="1" wp14:anchorId="45BF093A" wp14:editId="00C2C2F0">
             <wp:simplePos x="0" y="0"/>
@@ -1773,7 +1779,6 @@
         <w:pStyle w:val="Ttulo"/>
       </w:pPr>
       <w:r>
-        <w:lastRenderedPageBreak/>
         <w:t>7. GET - Listar todos los productos</w:t>
       </w:r>
     </w:p>
@@ -1911,7 +1916,6 @@
         <w:pStyle w:val="Ttulo"/>
       </w:pPr>
       <w:r>
-        <w:lastRenderedPageBreak/>
         <w:t>8. GET - Buscar producto por ID</w:t>
       </w:r>
     </w:p>
@@ -2060,7 +2064,6 @@
         <w:pStyle w:val="Ttulo"/>
       </w:pPr>
       <w:r>
-        <w:lastRenderedPageBreak/>
         <w:t>9. GET - Producto inexistente</w:t>
       </w:r>
     </w:p>
@@ -2203,7 +2206,6 @@
         <w:pStyle w:val="Ttulo"/>
       </w:pPr>
       <w:r>
-        <w:lastRenderedPageBreak/>
         <w:t>10. GET - Buscar por categoría</w:t>
       </w:r>
     </w:p>
@@ -2360,7 +2362,6 @@
         <w:pStyle w:val="Ttulo"/>
       </w:pPr>
       <w:r>
-        <w:lastRenderedPageBreak/>
         <w:t>11. GET - Productos con stock bajo</w:t>
       </w:r>
     </w:p>
@@ -2500,7 +2501,6 @@
         <w:pStyle w:val="Ttulo"/>
       </w:pPr>
       <w:r>
-        <w:lastRenderedPageBreak/>
         <w:t>1</w:t>
       </w:r>
       <w:r>
@@ -2653,7 +2653,6 @@
         <w:pStyle w:val="Ttulo"/>
       </w:pPr>
       <w:r>
-        <w:lastRenderedPageBreak/>
         <w:t>13. GET - Resumen del inventario</w:t>
       </w:r>
     </w:p>
@@ -2784,31 +2783,31 @@
         <w:pStyle w:val="Ttulo"/>
       </w:pPr>
       <w:r>
+        <w:t>14. Cálculos manuales</w:t>
+      </w:r>
+    </w:p>
+    <w:p>
+      <w:pPr>
+        <w:pStyle w:val="Ttulo"/>
+      </w:pPr>
+      <w:r>
+        <w:t>Subtotal 1</w:t>
+      </w:r>
+    </w:p>
+    <w:p>
+      <w:pPr>
+        <w:pStyle w:val="Ttulo"/>
+      </w:pPr>
+      <w:r>
+        <w:t>Arroz:</w:t>
+      </w:r>
+    </w:p>
+    <w:p>
+      <w:pPr>
+        <w:pStyle w:val="Ttulo"/>
+      </w:pPr>
+      <w:r>
         <w:lastRenderedPageBreak/>
-        <w:t>14. Cálculos manuales</w:t>
-      </w:r>
-    </w:p>
-    <w:p>
-      <w:pPr>
-        <w:pStyle w:val="Ttulo"/>
-      </w:pPr>
-      <w:r>
-        <w:t>Subtotal 1</w:t>
-      </w:r>
-    </w:p>
-    <w:p>
-      <w:pPr>
-        <w:pStyle w:val="Ttulo"/>
-      </w:pPr>
-      <w:r>
-        <w:t>Arroz:</w:t>
-      </w:r>
-    </w:p>
-    <w:p>
-      <w:pPr>
-        <w:pStyle w:val="Ttulo"/>
-      </w:pPr>
-      <w:r>
         <w:t>4 × Q8.50 = **Q34.00**</w:t>
       </w:r>
     </w:p>
@@ -2950,28 +2949,28 @@
         <w:pStyle w:val="Ttulo"/>
       </w:pPr>
       <w:r>
+        <w:t>15. Preguntas de reflexión</w:t>
+      </w:r>
+    </w:p>
+    <w:p>
+      <w:pPr>
+        <w:pStyle w:val="Ttulo"/>
+      </w:pPr>
+    </w:p>
+    <w:p>
+      <w:pPr>
+        <w:pStyle w:val="Ttulo"/>
+      </w:pPr>
+      <w:r>
+        <w:t>1. ¿Qué función cumple la anotación @RestController?</w:t>
+      </w:r>
+    </w:p>
+    <w:p>
+      <w:pPr>
+        <w:pStyle w:val="Ttulo"/>
+      </w:pPr>
+      <w:r>
         <w:lastRenderedPageBreak/>
-        <w:t>15. Preguntas de reflexión</w:t>
-      </w:r>
-    </w:p>
-    <w:p>
-      <w:pPr>
-        <w:pStyle w:val="Ttulo"/>
-      </w:pPr>
-    </w:p>
-    <w:p>
-      <w:pPr>
-        <w:pStyle w:val="Ttulo"/>
-      </w:pPr>
-      <w:r>
-        <w:t>1. ¿Qué función cumple la anotación @RestController?</w:t>
-      </w:r>
-    </w:p>
-    <w:p>
-      <w:pPr>
-        <w:pStyle w:val="Ttulo"/>
-      </w:pPr>
-      <w:r>
         <w:t xml:space="preserve">R// </w:t>
       </w:r>
       <w:r>
@@ -3089,17 +3088,12 @@
         <w:t xml:space="preserve">Se recorrió la lista de productos y se comparó el subtotal de cada producto utilizando el método </w:t>
       </w:r>
       <w:proofErr w:type="spellStart"/>
-      <w:proofErr w:type="gramStart"/>
       <w:r>
         <w:t>calcularSubtotal</w:t>
       </w:r>
       <w:proofErr w:type="spellEnd"/>
       <w:r>
-        <w:t>(</w:t>
-      </w:r>
-      <w:proofErr w:type="gramEnd"/>
-      <w:r>
-        <w:t>). Se conservó el producto que tuviera el subtotal más alto.</w:t>
+        <w:t>(). Se conservó el producto que tuviera el subtotal más alto.</w:t>
       </w:r>
     </w:p>
     <w:p>
@@ -3193,20 +3187,20 @@
         <w:pStyle w:val="Ttulo"/>
       </w:pPr>
       <w:r>
+        <w:t>16. Reflexión final</w:t>
+      </w:r>
+    </w:p>
+    <w:p>
+      <w:pPr>
+        <w:pStyle w:val="Ttulo"/>
+      </w:pPr>
+    </w:p>
+    <w:p>
+      <w:pPr>
+        <w:pStyle w:val="Ttulo"/>
+      </w:pPr>
+      <w:r>
         <w:lastRenderedPageBreak/>
-        <w:t>16. Reflexión final</w:t>
-      </w:r>
-    </w:p>
-    <w:p>
-      <w:pPr>
-        <w:pStyle w:val="Ttulo"/>
-      </w:pPr>
-    </w:p>
-    <w:p>
-      <w:pPr>
-        <w:pStyle w:val="Ttulo"/>
-      </w:pPr>
-      <w:r>
         <w:t xml:space="preserve">Durante esta actividad aprendí a crear una API REST básica utilizando Spring Boot y Maven. También comprendí cómo crear diferentes </w:t>
       </w:r>
       <w:proofErr w:type="spellStart"/>

</xml_diff>